<commit_message>
docs: Adicionando os arquivos das sprints dos dias 19/10 a 23/10, e a sprint do dia 26/10 a 30/10
</commit_message>
<xml_diff>
--- a/Sprints/Relatorio_Primeira_Sprint_Entre_Panelas.docx
+++ b/Sprints/Relatorio_Primeira_Sprint_Entre_Panelas.docx
@@ -74,8 +74,6 @@
         </w:rPr>
         <w:t>Atividades por área</w:t>
       </w:r>
-      <w:bookmarkStart w:id="0" w:name="_GoBack"/>
-      <w:bookmarkEnd w:id="0"/>
     </w:p>
     <w:p>
       <w:pPr>
@@ -115,11 +113,16 @@
         </w:rPr>
         <w:t xml:space="preserve">09/10/2026 — </w:t>
       </w:r>
-      <w:r>
-        <w:t xml:space="preserve">Desenvolvimento dos CRUDs </w:t>
-      </w:r>
       <w:proofErr w:type="spellStart"/>
       <w:r>
+        <w:t>Desenvolvimento</w:t>
+      </w:r>
+      <w:proofErr w:type="spellEnd"/>
+      <w:r>
+        <w:t xml:space="preserve"> dos CRUDs </w:t>
+      </w:r>
+      <w:proofErr w:type="spellStart"/>
+      <w:r>
         <w:t>relacionados</w:t>
       </w:r>
       <w:proofErr w:type="spellEnd"/>
@@ -167,7 +170,15 @@
       </w:r>
       <w:proofErr w:type="spellEnd"/>
       <w:r>
-        <w:t xml:space="preserve"> de usuários.</w:t>
+        <w:t xml:space="preserve"> de </w:t>
+      </w:r>
+      <w:proofErr w:type="spellStart"/>
+      <w:r>
+        <w:t>usuários</w:t>
+      </w:r>
+      <w:proofErr w:type="spellEnd"/>
+      <w:r>
+        <w:t>.</w:t>
       </w:r>
     </w:p>
     <w:p>
@@ -181,10 +192,39 @@
         <w:t xml:space="preserve">Acompanhamento: </w:t>
       </w:r>
       <w:r>
-        <w:t>A equipe avançou na organização da estrutura e nas operações de cadastro, mantendo o desenvolvi</w:t>
-      </w:r>
-      <w:r>
-        <w:t xml:space="preserve">mento alinhado </w:t>
+        <w:t xml:space="preserve">A equipe avançou na organização da estrutura e nas operações de </w:t>
+      </w:r>
+      <w:proofErr w:type="spellStart"/>
+      <w:r>
+        <w:t>cadastro</w:t>
+      </w:r>
+      <w:proofErr w:type="spellEnd"/>
+      <w:r>
+        <w:t xml:space="preserve">, </w:t>
+      </w:r>
+      <w:proofErr w:type="spellStart"/>
+      <w:r>
+        <w:t>mantendo</w:t>
+      </w:r>
+      <w:proofErr w:type="spellEnd"/>
+      <w:r>
+        <w:t xml:space="preserve"> o </w:t>
+      </w:r>
+      <w:proofErr w:type="spellStart"/>
+      <w:r>
+        <w:t>desenvolvimento</w:t>
+      </w:r>
+      <w:proofErr w:type="spellEnd"/>
+      <w:r>
+        <w:t xml:space="preserve"> </w:t>
+      </w:r>
+      <w:proofErr w:type="spellStart"/>
+      <w:r>
+        <w:t>alinhado</w:t>
+      </w:r>
+      <w:proofErr w:type="spellEnd"/>
+      <w:r>
+        <w:t xml:space="preserve"> </w:t>
       </w:r>
       <w:proofErr w:type="spellStart"/>
       <w:r>
@@ -358,10 +398,7 @@
         <w:t xml:space="preserve">Acompanhamento: </w:t>
       </w:r>
       <w:r>
-        <w:t>As atividades contribuíram para organizar o ace</w:t>
-      </w:r>
-      <w:r>
-        <w:t>sso aos dados. A revisão das estruturas deverá confirmar se o comportamento está adequado.</w:t>
+        <w:t>As atividades contribuíram para organizar o acesso aos dados. A revisão das estruturas deverá confirmar se o comportamento está adequado.</w:t>
       </w:r>
     </w:p>
     <w:p>
@@ -400,10 +437,31 @@
         <w:rPr>
           <w:b/>
         </w:rPr>
-        <w:t xml:space="preserve">13/10/2026 — </w:t>
-      </w:r>
-      <w:r>
-        <w:t>Configuração do Chefinho.</w:t>
+        <w:t>12</w:t>
+      </w:r>
+      <w:bookmarkStart w:id="0" w:name="_GoBack"/>
+      <w:bookmarkEnd w:id="0"/>
+      <w:r>
+        <w:rPr>
+          <w:b/>
+        </w:rPr>
+        <w:t xml:space="preserve">/10/2026 — </w:t>
+      </w:r>
+      <w:proofErr w:type="spellStart"/>
+      <w:r>
+        <w:t>Configuração</w:t>
+      </w:r>
+      <w:proofErr w:type="spellEnd"/>
+      <w:r>
+        <w:t xml:space="preserve"> do </w:t>
+      </w:r>
+      <w:proofErr w:type="spellStart"/>
+      <w:r>
+        <w:t>Chefinho</w:t>
+      </w:r>
+      <w:proofErr w:type="spellEnd"/>
+      <w:r>
+        <w:t>.</w:t>
       </w:r>
     </w:p>
     <w:p>
@@ -414,38 +472,40 @@
         <w:rPr>
           <w:b/>
         </w:rPr>
-        <w:t xml:space="preserve">14/10/2026 — </w:t>
-      </w:r>
-      <w:r>
-        <w:t>Execução de testes.</w:t>
-      </w:r>
-    </w:p>
-    <w:p>
-      <w:pPr>
-        <w:ind w:left="142" w:hanging="142"/>
-      </w:pPr>
+        <w:t>16</w:t>
+      </w:r>
       <w:r>
         <w:rPr>
           <w:b/>
         </w:rPr>
-        <w:t xml:space="preserve">16/10/2026 — </w:t>
-      </w:r>
-      <w:r>
-        <w:t>Cr</w:t>
-      </w:r>
-      <w:r>
-        <w:t>iação das tools e integração com o Backend.</w:t>
+        <w:t xml:space="preserve">/10/2026 — </w:t>
+      </w:r>
+      <w:proofErr w:type="spellStart"/>
+      <w:r>
+        <w:t>Execução</w:t>
+      </w:r>
+      <w:proofErr w:type="spellEnd"/>
+      <w:r>
+        <w:t xml:space="preserve"> de testes.</w:t>
       </w:r>
     </w:p>
     <w:p>
       <w:pPr>
         <w:spacing w:after="100"/>
       </w:pPr>
+      <w:proofErr w:type="spellStart"/>
       <w:r>
         <w:rPr>
           <w:b/>
         </w:rPr>
-        <w:t xml:space="preserve">Acompanhamento: </w:t>
+        <w:t>Acompanhamento</w:t>
+      </w:r>
+      <w:proofErr w:type="spellEnd"/>
+      <w:r>
+        <w:rPr>
+          <w:b/>
+        </w:rPr>
+        <w:t xml:space="preserve">: </w:t>
       </w:r>
       <w:r>
         <w:t xml:space="preserve">O </w:t>
@@ -534,10 +594,7 @@
         <w:t xml:space="preserve"> com o back-end </w:t>
       </w:r>
       <w:r>
-        <w:t>segue</w:t>
-      </w:r>
-      <w:r>
-        <w:t xml:space="preserve"> </w:t>
+        <w:t xml:space="preserve">segue </w:t>
       </w:r>
       <w:proofErr w:type="spellStart"/>
       <w:r>
@@ -581,10 +638,7 @@
         <w:t xml:space="preserve">07/10/2026 — </w:t>
       </w:r>
       <w:r>
-        <w:t>Definição da estrutura e do que será desenvolvid</w:t>
-      </w:r>
-      <w:r>
-        <w:t>o.</w:t>
+        <w:t>Definição da estrutura e do que será desenvolvido.</w:t>
       </w:r>
     </w:p>
     <w:p>
@@ -634,19 +688,34 @@
         <w:rPr>
           <w:b/>
         </w:rPr>
-        <w:t>A equipe demon</w:t>
-      </w:r>
-      <w:r>
-        <w:rPr>
-          <w:b/>
-        </w:rPr>
-        <w:t xml:space="preserve">strou colaboração e organização na divisão das tarefas. </w:t>
-      </w:r>
-      <w:r>
-        <w:t>Cada frente contribuiu dentro de sua responsabilidade, e as atividades realizadas até 09/10 estão alinhadas ao planejamento inicial. A comunicação entre as áreas é importante para garantir a compatibi</w:t>
-      </w:r>
-      <w:r>
-        <w:t xml:space="preserve">lidade entre API, banco de dados, assistente e aplicativo mobile. As próximas tarefas permanecem </w:t>
+        <w:t xml:space="preserve">A equipe demonstrou colaboração e organização na divisão das tarefas. </w:t>
+      </w:r>
+      <w:r>
+        <w:t xml:space="preserve">Cada frente contribuiu dentro de sua responsabilidade, e as atividades realizadas até 09/10 estão alinhadas ao planejamento inicial. A comunicação entre as áreas é importante para garantir a compatibilidade entre API, banco de dados, assistente e aplicativo mobile. As </w:t>
+      </w:r>
+      <w:proofErr w:type="spellStart"/>
+      <w:r>
+        <w:t>próximas</w:t>
+      </w:r>
+      <w:proofErr w:type="spellEnd"/>
+      <w:r>
+        <w:t xml:space="preserve"> </w:t>
+      </w:r>
+      <w:proofErr w:type="spellStart"/>
+      <w:r>
+        <w:t>tarefas</w:t>
+      </w:r>
+      <w:proofErr w:type="spellEnd"/>
+      <w:r>
+        <w:t xml:space="preserve"> </w:t>
+      </w:r>
+      <w:proofErr w:type="spellStart"/>
+      <w:r>
+        <w:t>permanecem</w:t>
+      </w:r>
+      <w:proofErr w:type="spellEnd"/>
+      <w:r>
+        <w:t xml:space="preserve"> </w:t>
       </w:r>
       <w:proofErr w:type="spellStart"/>
       <w:r>
@@ -687,10 +756,7 @@
         <w:t xml:space="preserve">Conclusão. </w:t>
       </w:r>
       <w:r>
-        <w:t>A primeira sprint estabeleceu uma base para o desenvolvimento do Entre Panelas. O andamento é coerente com os obj</w:t>
-      </w:r>
-      <w:r>
-        <w:t>etivos definidos, com atenção à revisão das estruturas e à integração das funcionalidades nas próximas etapas.</w:t>
+        <w:t>A primeira sprint estabeleceu uma base para o desenvolvimento do Entre Panelas. O andamento é coerente com os objetivos definidos, com atenção à revisão das estruturas e à integração das funcionalidades nas próximas etapas.</w:t>
       </w:r>
     </w:p>
     <w:sectPr>
@@ -1261,10 +1327,6 @@
     <w:lsdException w:name="Book Title" w:uiPriority="33" w:qFormat="1"/>
     <w:lsdException w:name="Bibliography" w:semiHidden="1" w:uiPriority="37" w:unhideWhenUsed="1"/>
     <w:lsdException w:name="TOC Heading" w:semiHidden="1" w:uiPriority="39" w:unhideWhenUsed="1" w:qFormat="1"/>
-    <w:lsdException w:name="Grid Table Light" w:semiHidden="1" w:unhideWhenUsed="1"/>
-    <w:lsdException w:name="Grid Table 1 Light" w:semiHidden="1" w:unhideWhenUsed="1"/>
-    <w:lsdException w:name="Grid Table 2" w:semiHidden="1" w:unhideWhenUsed="1"/>
-    <w:lsdException w:name="Grid Table 3" w:semiHidden="1" w:unhideWhenUsed="1"/>
     <w:lsdException w:name="Grid Table 4" w:uiPriority="49"/>
     <w:lsdException w:name="Grid Table 5 Dark" w:uiPriority="50"/>
     <w:lsdException w:name="Grid Table 6 Colorful" w:uiPriority="51"/>
@@ -12693,7 +12755,7 @@
 </file>
 
 <file path=customXml/itemProps1.xml><?xml version="1.0" encoding="utf-8"?>
-<ds:datastoreItem xmlns:ds="http://schemas.openxmlformats.org/officeDocument/2006/customXml" ds:itemID="{7D0028DB-C84B-445E-BEAE-90251BAD046C}">
+<ds:datastoreItem xmlns:ds="http://schemas.openxmlformats.org/officeDocument/2006/customXml" ds:itemID="{161CE1F1-DD9C-49D3-A1BE-5398FFCD6621}">
   <ds:schemaRefs>
     <ds:schemaRef ds:uri="http://schemas.openxmlformats.org/officeDocument/2006/bibliography"/>
   </ds:schemaRefs>

</xml_diff>